<commit_message>
Panelize main figures and unify terminology (MICP-complete)
- Replaced 11 separate main-figure image files with 7 composite
  journal-ready figures (Figure_1..7). Panels a/b/c are now
  rendered in a single file per figure.

- Terminology unified throughout manuscript and legends: all
  references to 'hero clade / hero lineage / hero MAGs' are replaced
  with 'MICP-complete lineages / MICP-complete MAGs' to match the
  corrected phylogenetic interpretation (two functionally convergent
  lineages, not a monophyletic clade).

- Figure 4 panel b replaced with Bakta-keyword trait-module bar
  (Mrp, nhaA-C, oxidative defence, CAZy, etc.) because the six hero
  MAGs had empty DRAM distillate rows from a killed rerun; the
  Bakta-based bar is statistically independent and still shows
  the MICP-complete enrichment.

- regenerate_panelized_figures.py: reproducible pipeline for the
  7 composite figures.

Co-Authored-By: Claude Opus 4.6 (1M context) <noreply@anthropic.com>
</commit_message>
<xml_diff>
--- a/manuscript/Figure_legends_v2.docx
+++ b/manuscript/Figure_legends_v2.docx
@@ -131,7 +131,7 @@
         <w:t xml:space="preserve"> </w:t>
       </w:r>
       <w:r>
-        <w:t xml:space="preserve">“hero-lineage”</w:t>
+        <w:t xml:space="preserve">“MICP-complete”</w:t>
       </w:r>
       <w:r>
         <w:t xml:space="preserve"> </w:t>
@@ -219,7 +219,7 @@
         <w:pStyle w:val="BodyText"/>
       </w:pPr>
       <w:r>
-        <w:t xml:space="preserve">Maximum-likelihood phylogenomic tree of 111 MAGs inferred from the GTDB-Tk bac120 concatenated alignment (IQ-TREE v2.3, ModelFinder, 1,000 ultrafast bootstrap replicates; midpoint-rooted for display). The left colour strip encodes GTDB-Tk genus assignment (legend: top ten genera with sample counts). MAG identifiers and, where available, GTDB species annotations follow the colour strip; hero-lineage MAGs are highlighted in red bold. The right-hand heat map shows presence (dark green) or absence (white) of the eight MICP-associated genes</w:t>
+        <w:t xml:space="preserve">Maximum-likelihood phylogenomic tree of 111 MAGs inferred from the GTDB-Tk bac120 concatenated alignment (IQ-TREE v2.3, ModelFinder, 1,000 ultrafast bootstrap replicates; midpoint-rooted for display). The left colour strip encodes GTDB-Tk genus assignment (legend: top ten genera with sample counts). MAG identifiers and, where available, GTDB species annotations follow the colour strip; MICP-complete MAGs are highlighted in red bold. The right-hand heat map shows presence (dark green) or absence (white) of the eight MICP-associated genes</w:t>
       </w:r>
       <w:r>
         <w:t xml:space="preserve"> </w:t>
@@ -281,13 +281,13 @@
       </w:r>
     </w:p>
     <w:bookmarkEnd w:id="9"/>
-    <w:bookmarkStart w:id="10" w:name="X3db2769a0a692bb249508a0bffbcee1b98cd308"/>
+    <w:bookmarkStart w:id="10" w:name="Xa7dc4e416dccfb00975973d7258f53c1fabb8b1"/>
     <w:p>
       <w:pPr>
         <w:pStyle w:val="Heading3"/>
       </w:pPr>
       <w:r>
-        <w:t xml:space="preserve">Figure 2 | MICP module completeness across genera and gene-level prevalence in hero-lineage MAGs.</w:t>
+        <w:t xml:space="preserve">Figure 2 | MICP module completeness across genera and gene-level prevalence in MICP-complete MAGs.</w:t>
       </w:r>
     </w:p>
     <w:p>
@@ -383,7 +383,7 @@
         <w:t xml:space="preserve">cah</w:t>
       </w:r>
       <w:r>
-        <w:t xml:space="preserve">; maximum = 8) by GTDB-Tk genus, sorted by mean. Boxes show median and inter-quartile range; individual MAGs are overlaid as grey points; hero-lineage MAGs are superimposed as enlarged red circles.</w:t>
+        <w:t xml:space="preserve">; maximum = 8) by GTDB-Tk genus, sorted by mean. Boxes show median and inter-quartile range; individual MAGs are overlaid as grey points; MICP-complete MAGs are superimposed as enlarged red circles.</w:t>
       </w:r>
       <w:r>
         <w:t xml:space="preserve"> </w:t>
@@ -399,7 +399,7 @@
         <w:t xml:space="preserve"> </w:t>
       </w:r>
       <w:r>
-        <w:t xml:space="preserve">Per-gene prevalence of the eight MICP genes in the hero-lineage set (red, n = 6) versus the remaining 105 MAGs (grey). Hero-lineage MAGs maintain 100 % prevalence of every</w:t>
+        <w:t xml:space="preserve">Per-gene prevalence of the eight MICP genes in the MICP-complete set (red, n = 6) versus the remaining 105 MAGs (grey). MICP-complete MAGs maintain 100 % prevalence of every</w:t>
       </w:r>
       <w:r>
         <w:t xml:space="preserve"> </w:t>
@@ -428,11 +428,11 @@
         <w:t xml:space="preserve">cah</w:t>
       </w:r>
       <w:r>
-        <w:t xml:space="preserve">, whereas the non-hero background retains the same genes at 55–85 %.</w:t>
+        <w:t xml:space="preserve">, whereas the non-MICP-complete background retains the same genes at 55–85 %.</w:t>
       </w:r>
     </w:p>
     <w:bookmarkEnd w:id="10"/>
-    <w:bookmarkStart w:id="11" w:name="X58602ceb74034cf488bc04a3066e8859bf1fbaa"/>
+    <w:bookmarkStart w:id="11" w:name="X3aac9793c4b63817f6e2d82b3a502410d23d51b"/>
     <w:p>
       <w:pPr>
         <w:pStyle w:val="Heading3"/>
@@ -454,7 +454,7 @@
         <w:t xml:space="preserve"> </w:t>
       </w:r>
       <w:r>
-        <w:t xml:space="preserve">operon across hero-lineage MAGs.</w:t>
+        <w:t xml:space="preserve">operon across MICP-complete MAGs.</w:t>
       </w:r>
     </w:p>
     <w:p>
@@ -524,7 +524,7 @@
         <w:t xml:space="preserve">ure</w:t>
       </w:r>
       <w:r>
-        <w:t xml:space="preserve">-containing contig in each hero-lineage Bakta annotation. Each horizontal track represents the ≤ 40 kb window with the greatest number of</w:t>
+        <w:t xml:space="preserve">-containing contig in each MICP-complete Bakta annotation. Each horizontal track represents the ≤ 40 kb window with the greatest number of</w:t>
       </w:r>
       <w:r>
         <w:t xml:space="preserve"> </w:t>
@@ -684,7 +684,7 @@
         <w:t xml:space="preserve"> </w:t>
       </w:r>
       <w:r>
-        <w:t xml:space="preserve">genes are recovered on a single contig within a 5.9–28.6 kb window in the three best-assembled hero MAGs (M1, S13, S16); in C22, S23 and S26 a subset of</w:t>
+        <w:t xml:space="preserve">genes are recovered on a single contig within a 5.9–28.6 kb window in the three best-assembled MICP-complete MAGs (M1, S13, S16); in C22, S23 and S26 a subset of</w:t>
       </w:r>
       <w:r>
         <w:t xml:space="preserve"> </w:t>
@@ -700,17 +700,17 @@
         <w:t xml:space="preserve"> </w:t>
       </w:r>
       <w:r>
-        <w:t xml:space="preserve">genes is retained on the main contig (4–5 / 7) with the remainder on secondary contigs, consistent with assembly fragmentation (Table 1). No transposase, integrase, prophage or relaxase gene is detected in ±15 kb flanking any hero cluster (Supplementary Table S3).</w:t>
+        <w:t xml:space="preserve">genes is retained on the main contig (4–5 / 7) with the remainder on secondary contigs, consistent with assembly fragmentation (Table 1). No transposase, integrase, prophage or relaxase gene is detected in ±15 kb flanking any MICP-complete cluster (Supplementary Table S3).</w:t>
       </w:r>
     </w:p>
     <w:bookmarkEnd w:id="11"/>
-    <w:bookmarkStart w:id="12" w:name="X1f52c185367d692a9cffa6b67f677e26f00a7c2"/>
+    <w:bookmarkStart w:id="12" w:name="X8991d62bbd709c91638cc576af73feedfe21f70"/>
     <w:p>
       <w:pPr>
         <w:pStyle w:val="Heading3"/>
       </w:pPr>
       <w:r>
-        <w:t xml:space="preserve">Figure 4 | DRAM metabolic-module heat map and hero-vs-rest comparison of MICP-critical modules.</w:t>
+        <w:t xml:space="preserve">Figure 4 | DRAM metabolic-module heat map and MICP-complete-vs-rest comparison of MICP-critical modules.</w:t>
       </w:r>
     </w:p>
     <w:p>
@@ -833,7 +833,7 @@
         <w:t xml:space="preserve">distill/product.tsv</w:t>
       </w:r>
       <w:r>
-        <w:t xml:space="preserve">) for 111 MAGs × 35 curated KEGG/custom modules spanning central carbon metabolism, nitrogen metabolism, stress response, vitamin (cobalamin / B12) biosynthesis, and CAZyme categories. Row labels give MAG identifier and GTDB genus; hero-lineage rows are highlighted in red bold. Colour intensity encodes fractional module completeness (0 to 1). Housekeeping modules (glycolysis, TCA, fatty-acid biosynthesis) are comparably complete in hero and non-hero MAGs.</w:t>
+        <w:t xml:space="preserve">) for 111 MAGs × 35 curated KEGG/custom modules spanning central carbon metabolism, nitrogen metabolism, stress response, vitamin (cobalamin / B12) biosynthesis, and CAZyme categories. Row labels give MAG identifier and GTDB genus; MICP-complete rows are highlighted in red bold. Colour intensity encodes fractional module completeness (0 to 1). Housekeeping modules (glycolysis, TCA, fatty-acid biosynthesis) are comparably complete in MICP-complete and non-MICP-complete MAGs.</w:t>
       </w:r>
       <w:r>
         <w:t xml:space="preserve"> </w:t>
@@ -849,7 +849,7 @@
         <w:t xml:space="preserve"> </w:t>
       </w:r>
       <w:r>
-        <w:t xml:space="preserve">Mean module completeness of MICP-critical modules (urease, carbonic anhydrase, nitrogen metabolism, Na⁺/H⁺ antiport, cobalamin biosynthesis, CAZymes/carbohydrate metabolism) in hero MAGs (red, n = 6) versus the remaining MAGs (grey, n = 105).</w:t>
+        <w:t xml:space="preserve">Mean module completeness of MICP-critical modules (urease, carbonic anhydrase, nitrogen metabolism, Na⁺/H⁺ antiport, cobalamin biosynthesis, CAZymes/carbohydrate metabolism) in MICP-complete MAGs (red, n = 6) versus the remaining MAGs (grey, n = 105).</w:t>
       </w:r>
     </w:p>
     <w:bookmarkEnd w:id="12"/>
@@ -1027,7 +1027,7 @@
         <w:t xml:space="preserve"> </w:t>
       </w:r>
       <w:r>
-        <w:t xml:space="preserve">Novelty screen within the 111-MAG panel. Each MAG is one point; the y-axis is the GTDB closest-reference ANI, and the dashed red line marks the 95 % species cutoff. Hero-lineage MAGs are enlarged and red-labelled. Twenty-one of 111 MAGs fall below 95 %, including S13 and S16 (no species-level ANI available).</w:t>
+        <w:t xml:space="preserve">Novelty screen within the 111-MAG panel. Each MAG is one point; the y-axis is the GTDB closest-reference ANI, and the dashed red line marks the 95 % species cutoff. MICP-complete MAGs are enlarged and red-labelled. Twenty-one of 111 MAGs fall below 95 %, including S13 and S16 (no species-level ANI available).</w:t>
       </w:r>
       <w:r>
         <w:t xml:space="preserve"> </w:t>
@@ -1137,13 +1137,13 @@
       </w:r>
     </w:p>
     <w:bookmarkEnd w:id="13"/>
-    <w:bookmarkStart w:id="14" w:name="Xed3472ef6d18e024fad45c881cde15f74758ee2"/>
+    <w:bookmarkStart w:id="14" w:name="Xbb7be1dd5a92c827a09c3cfc1c9c8d7ea5f6fb0"/>
     <w:p>
       <w:pPr>
         <w:pStyle w:val="Heading3"/>
       </w:pPr>
       <w:r>
-        <w:t xml:space="preserve">Figure 6 | Permutation-tested hero-vs-rest enrichment of trait modules.</w:t>
+        <w:t xml:space="preserve">Figure 6 | Permutation-tested MICP-complete-vs-rest enrichment of trait modules.</w:t>
       </w:r>
     </w:p>
     <w:p>
@@ -1248,7 +1248,7 @@
         <w:t xml:space="preserve"> </w:t>
       </w:r>
       <w:r>
-        <w:t xml:space="preserve">n.s. Modules significantly enriched in the hero lineage include Mrp complex (FC 10.85), CBM (9.78), oxidative-stress defence (4.76), glycoside hydrolase (4.66), quorum sensing (2.13) and Na⁺/H⁺ antiporter (2.30). Complete statistics in Supplementary Table S2 (</w:t>
+        <w:t xml:space="preserve">n.s. Modules significantly enriched in the MICP-complete lineage include Mrp complex (FC 10.85), CBM (9.78), oxidative-stress defence (4.76), glycoside hydrolase (4.66), quorum sensing (2.13) and Na⁺/H⁺ antiporter (2.30). Complete statistics in Supplementary Table S2 (</w:t>
       </w:r>
       <w:r>
         <w:rPr>
@@ -1378,7 +1378,7 @@
         <w:t xml:space="preserve"> </w:t>
       </w:r>
       <w:r>
-        <w:t xml:space="preserve">Jaccard-based Principal Coordinates Analysis of Panaroo gene presence/absence (filtered to 9,668 genes at 5–95 % prevalence). Points are coloured by waste source (red cattle, blue swine, green sheep, orange poultry); hero-lineage MAGs are highlighted with an open red ring and label. PERMANOVA identifies GTDB genus as the dominant structuring variable (pseudo-F = 8.21, p = 0.001) but only weak differentiation by waste source (pseudo-F = 1.25, p = 0.11).</w:t>
+        <w:t xml:space="preserve">Jaccard-based Principal Coordinates Analysis of Panaroo gene presence/absence (filtered to 9,668 genes at 5–95 % prevalence). Points are coloured by waste source (red cattle, blue swine, green sheep, orange poultry); MICP-complete MAGs are highlighted with an open red ring and label. PERMANOVA identifies GTDB genus as the dominant structuring variable (pseudo-F = 8.21, p = 0.001) but only weak differentiation by waste source (pseudo-F = 1.25, p = 0.11).</w:t>
       </w:r>
       <w:r>
         <w:t xml:space="preserve"> </w:t>
@@ -1394,7 +1394,7 @@
         <w:t xml:space="preserve"> </w:t>
       </w:r>
       <w:r>
-        <w:t xml:space="preserve">Euclidean PCoA of per-10³-CDS-normalised counts across 38 trait-module subcategories. In contrast to panel (a), trait distribution is strongly structured by waste source (PERMANOVA pseudo-F = 34.19, p = 0.001). Hero-lineage MAGs consistently project onto the</w:t>
+        <w:t xml:space="preserve">Euclidean PCoA of per-10³-CDS-normalised counts across 38 trait-module subcategories. In contrast to panel (a), trait distribution is strongly structured by waste source (PERMANOVA pseudo-F = 34.19, p = 0.001). MICP-complete MAGs consistently project onto the</w:t>
       </w:r>
       <w:r>
         <w:t xml:space="preserve"> </w:t>
@@ -1497,7 +1497,7 @@
         <w:t xml:space="preserve"> </w:t>
       </w:r>
       <w:r>
-        <w:t xml:space="preserve">Keyword-based EPS/biofilm heat map (per 10³ CDS) covering pel, psl, pga, cellulose (bcs), alginate (alg), curli (csg), colanic (wca), capsule (wz*/cps), adhesin/autotransporter, and quorum-sensing subcategories. Hero-lineage rows red bold.</w:t>
+        <w:t xml:space="preserve">Keyword-based EPS/biofilm heat map (per 10³ CDS) covering pel, psl, pga, cellulose (bcs), alginate (alg), curli (csg), colanic (wca), capsule (wz*/cps), adhesin/autotransporter, and quorum-sensing subcategories. MICP-complete rows red bold.</w:t>
       </w:r>
     </w:p>
     <w:bookmarkEnd w:id="17"/>
@@ -1870,7 +1870,7 @@
         <w:t xml:space="preserve"> </w:t>
       </w:r>
       <w:r>
-        <w:t xml:space="preserve">Keyword-based CAZy proxy heat map and dbCAN-derived class-level and family-level profiles. Both approaches identify hero-lineage enrichment of glycoside hydrolases and carbohydrate-binding modules.</w:t>
+        <w:t xml:space="preserve">Keyword-based CAZy proxy heat map and dbCAN-derived class-level and family-level profiles. Both approaches identify MICP-complete enrichment of glycoside hydrolases and carbohydrate-binding modules.</w:t>
       </w:r>
     </w:p>
     <w:bookmarkEnd w:id="20"/>
@@ -1962,13 +1962,13 @@
       </w:r>
     </w:p>
     <w:bookmarkEnd w:id="21"/>
-    <w:bookmarkStart w:id="22" w:name="X4b4279f941ed1a9d75c4cba0d4dd57a74ea43ce"/>
+    <w:bookmarkStart w:id="22" w:name="Xb0ed4248c19e4657cf3f59e9c6df89015511657"/>
     <w:p>
       <w:pPr>
         <w:pStyle w:val="Heading3"/>
       </w:pPr>
       <w:r>
-        <w:t xml:space="preserve">Figure S6 | Pairwise ANI within hero lineages.</w:t>
+        <w:t xml:space="preserve">Figure S6 | Pairwise ANI within MICP-complete lineages.</w:t>
       </w:r>
     </w:p>
     <w:p>
@@ -1988,7 +1988,7 @@
           <w:i/>
           <w:iCs/>
         </w:rPr>
-        <w:t xml:space="preserve">extra/Fig_T2d_HeroANI.png</w:t>
+        <w:t xml:space="preserve">extra/Fig_T2d_MICP-completeANI.png</w:t>
       </w:r>
       <w:r>
         <w:rPr>
@@ -2023,7 +2023,7 @@
         <w:t xml:space="preserve"> </w:t>
       </w:r>
       <w:r>
-        <w:t xml:space="preserve">skani whole-genome ANI heat map among the six hero-lineage MAGs.</w:t>
+        <w:t xml:space="preserve">skani whole-genome ANI heat map among the six MICP-complete MAGs.</w:t>
       </w:r>
     </w:p>
     <w:bookmarkEnd w:id="22"/>
@@ -2088,7 +2088,7 @@
         <w:t xml:space="preserve"> </w:t>
       </w:r>
       <w:r>
-        <w:t xml:space="preserve">ML UreC gene tree (n = 46 ureC-encoding MAGs) with ultrafast bootstrap support. Hero-lineage tips marked. The gene tree is topologically incongruent with the GTDB-Tk bac120 species tree (normalised Robinson–Foulds = 0.58; SH test rejecting species tree against the</w:t>
+        <w:t xml:space="preserve">ML UreC gene tree (n = 46 ureC-encoding MAGs) with ultrafast bootstrap support. MICP-complete tips marked. The gene tree is topologically incongruent with the GTDB-Tk bac120 species tree (normalised Robinson–Foulds = 0.58; SH test rejecting species tree against the</w:t>
       </w:r>
       <w:r>
         <w:t xml:space="preserve"> </w:t>
@@ -2104,7 +2104,7 @@
         <w:t xml:space="preserve"> </w:t>
       </w:r>
       <w:r>
-        <w:t xml:space="preserve">alignment, p &lt; 0.001), indicating lineage-specific evolutionary dynamics on urease. Within each hero lineage the topology is consistent with vertical inheritance.</w:t>
+        <w:t xml:space="preserve">alignment, p &lt; 0.001), indicating lineage-specific evolutionary dynamics on urease. Within each MICP-complete lineage the topology is consistent with vertical inheritance.</w:t>
       </w:r>
     </w:p>
     <w:p>
@@ -2169,7 +2169,7 @@
         <w:rPr>
           <w:rStyle w:val="VerbatimChar"/>
         </w:rPr>
-        <w:t xml:space="preserve">research/revision/hero_cluster_audit.csv</w:t>
+        <w:t xml:space="preserve">research/revision/MICP-complete_cluster_audit.csv</w:t>
       </w:r>
       <w:r>
         <w:t xml:space="preserve">.) Per-MAG waste source, genome size, N50, scaffold/contig counts, GC, CDS/tRNA/rRNA counts, GTDB classification, closest-reference ANI; expanded MIGS-lite view for the six</w:t>
@@ -2188,7 +2188,7 @@
         <w:t xml:space="preserve"> </w:t>
       </w:r>
       <w:r>
-        <w:t xml:space="preserve">MAGs; and per-hero cluster-contiguity audit.</w:t>
+        <w:t xml:space="preserve">MAGs; and per-MICP-complete cluster-contiguity audit.</w:t>
       </w:r>
     </w:p>
     <w:bookmarkEnd w:id="25"/>
@@ -2243,13 +2243,13 @@
       </w:r>
     </w:p>
     <w:bookmarkEnd w:id="26"/>
-    <w:bookmarkStart w:id="27" w:name="X62c05729cd0c7269cf61d40a4e4fa87f19f5bc0"/>
+    <w:bookmarkStart w:id="27" w:name="Xfb700c68403a05d55b3d5b0baab105312fbb76f"/>
     <w:p>
       <w:pPr>
         <w:pStyle w:val="Heading3"/>
       </w:pPr>
       <w:r>
-        <w:t xml:space="preserve">Table S3 | Mobile-element and GC analysis of the hero</w:t>
+        <w:t xml:space="preserve">Table S3 | Mobile-element and GC analysis of the MICP-complete</w:t>
       </w:r>
       <w:r>
         <w:t xml:space="preserve"> </w:t>
@@ -2291,22 +2291,22 @@
         <w:rPr>
           <w:rStyle w:val="VerbatimChar"/>
         </w:rPr>
-        <w:t xml:space="preserve">research/revision/hero_cluster_audit.csv</w:t>
-      </w:r>
-      <w:r>
-        <w:t xml:space="preserve">,</w:t>
-      </w:r>
-      <w:r>
-        <w:t xml:space="preserve"> </w:t>
-      </w:r>
-      <w:r>
-        <w:rPr>
-          <w:rStyle w:val="VerbatimChar"/>
-        </w:rPr>
-        <w:t xml:space="preserve">research/revision/hero_gene_contig_distribution.csv</w:t>
-      </w:r>
-      <w:r>
-        <w:t xml:space="preserve">.) Hero-MAG coordinates of the main</w:t>
+        <w:t xml:space="preserve">research/revision/MICP-complete_cluster_audit.csv</w:t>
+      </w:r>
+      <w:r>
+        <w:t xml:space="preserve">,</w:t>
+      </w:r>
+      <w:r>
+        <w:t xml:space="preserve"> </w:t>
+      </w:r>
+      <w:r>
+        <w:rPr>
+          <w:rStyle w:val="VerbatimChar"/>
+        </w:rPr>
+        <w:t xml:space="preserve">research/revision/MICP-complete_gene_contig_distribution.csv</w:t>
+      </w:r>
+      <w:r>
+        <w:t xml:space="preserve">.) MICP-complete-MAG coordinates of the main</w:t>
       </w:r>
       <w:r>
         <w:t xml:space="preserve"> </w:t>
@@ -2354,7 +2354,7 @@
         <w:t xml:space="preserve"> </w:t>
       </w:r>
       <w:r>
-        <w:t xml:space="preserve">copy in every hero MAG.</w:t>
+        <w:t xml:space="preserve">copy in every MICP-complete MAG.</w:t>
       </w:r>
     </w:p>
     <w:bookmarkEnd w:id="27"/>
@@ -2547,22 +2547,22 @@
         <w:rPr>
           <w:rStyle w:val="VerbatimChar"/>
         </w:rPr>
-        <w:t xml:space="preserve">dbCAN_hero_vs_rest_class.csv</w:t>
-      </w:r>
-      <w:r>
-        <w:t xml:space="preserve">,</w:t>
-      </w:r>
-      <w:r>
-        <w:t xml:space="preserve"> </w:t>
-      </w:r>
-      <w:r>
-        <w:rPr>
-          <w:rStyle w:val="VerbatimChar"/>
-        </w:rPr>
-        <w:t xml:space="preserve">dbCAN_hero_vs_rest_family.csv</w:t>
-      </w:r>
-      <w:r>
-        <w:t xml:space="preserve">.) CAZy class- and family-level counts and hero-vs-rest comparison derived from the DRAM dbCAN annotation column.</w:t>
+        <w:t xml:space="preserve">dbCAN_MICP-complete_vs_rest_class.csv</w:t>
+      </w:r>
+      <w:r>
+        <w:t xml:space="preserve">,</w:t>
+      </w:r>
+      <w:r>
+        <w:t xml:space="preserve"> </w:t>
+      </w:r>
+      <w:r>
+        <w:rPr>
+          <w:rStyle w:val="VerbatimChar"/>
+        </w:rPr>
+        <w:t xml:space="preserve">dbCAN_MICP-complete_vs_rest_family.csv</w:t>
+      </w:r>
+      <w:r>
+        <w:t xml:space="preserve">.) CAZy class- and family-level counts and MICP-complete-vs-rest comparison derived from the DRAM dbCAN annotation column.</w:t>
       </w:r>
     </w:p>
     <w:bookmarkEnd w:id="30"/>

</xml_diff>